<commit_message>
Updated README, Added the API documentation and Technical Report
</commit_message>
<xml_diff>
--- a/report/Technical Report.docx
+++ b/report/Technical Report.docx
@@ -368,7 +368,7 @@
           </mc:Choice>
           <mc:Fallback>
             <w:pict>
-              <v:line w14:anchorId="7202B261" id="Straight Connector 4" o:spid="_x0000_s1026" style="position:absolute;z-index:251660288;visibility:visible;mso-wrap-style:square;mso-width-percent:0;mso-height-percent:0;mso-wrap-distance-left:9pt;mso-wrap-distance-top:0;mso-wrap-distance-right:9pt;mso-wrap-distance-bottom:0;mso-position-horizontal:absolute;mso-position-horizontal-relative:page;mso-position-vertical:absolute;mso-position-vertical-relative:page;mso-width-percent:0;mso-height-percent:0;mso-width-relative:page;mso-height-relative:page" from="13.05pt,197.5pt" to="580pt,197.5pt" o:gfxdata="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">
+              <v:line w14:anchorId="4B00E0DD" id="Straight Connector 4" o:spid="_x0000_s1026" style="position:absolute;z-index:251660288;visibility:visible;mso-wrap-style:square;mso-width-percent:0;mso-height-percent:0;mso-wrap-distance-left:9pt;mso-wrap-distance-top:0;mso-wrap-distance-right:9pt;mso-wrap-distance-bottom:0;mso-position-horizontal:absolute;mso-position-horizontal-relative:page;mso-position-vertical:absolute;mso-position-vertical-relative:page;mso-width-percent:0;mso-height-percent:0;mso-width-relative:page;mso-height-relative:page" from="13.05pt,197.5pt" to="580pt,197.5pt" o:gfxdata="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">
                 <w10:wrap anchorx="page" anchory="page"/>
                 <w10:anchorlock/>
               </v:line>
@@ -474,15 +474,17 @@
             <w:pStyle w:val="TOC1"/>
             <w:tabs>
               <w:tab w:val="left" w:pos="480"/>
-              <w:tab w:val="right" w:leader="dot" w:pos="9004"/>
+              <w:tab w:val="right" w:leader="dot" w:pos="9736"/>
             </w:tabs>
             <w:rPr>
               <w:rFonts w:eastAsiaTheme="minorEastAsia" w:cstheme="minorBidi"/>
               <w:b w:val="0"/>
               <w:bCs w:val="0"/>
-              <w:caps/>
+              <w:i w:val="0"/>
+              <w:iCs w:val="0"/>
               <w:noProof/>
               <w:kern w:val="2"/>
+              <w:szCs w:val="24"/>
               <w:lang w:val="en-AE" w:eastAsia="en-US"/>
               <w14:ligatures w14:val="standardContextual"/>
             </w:rPr>
@@ -504,7 +506,7 @@
             </w:rPr>
             <w:fldChar w:fldCharType="separate"/>
           </w:r>
-          <w:hyperlink w:anchor="_Toc224051433" w:history="1">
+          <w:hyperlink w:anchor="_Toc224314026" w:history="1">
             <w:r>
               <w:rPr>
                 <w:rStyle w:val="Hyperlink"/>
@@ -517,9 +519,11 @@
                 <w:rFonts w:eastAsiaTheme="minorEastAsia" w:cstheme="minorBidi"/>
                 <w:b w:val="0"/>
                 <w:bCs w:val="0"/>
-                <w:caps/>
+                <w:i w:val="0"/>
+                <w:iCs w:val="0"/>
                 <w:noProof/>
                 <w:kern w:val="2"/>
+                <w:szCs w:val="24"/>
                 <w:lang w:val="en-AE" w:eastAsia="en-US"/>
                 <w14:ligatures w14:val="standardContextual"/>
               </w:rPr>
@@ -551,7 +555,7 @@
                 <w:noProof/>
                 <w:webHidden/>
               </w:rPr>
-              <w:instrText xml:space="preserve"> PAGEREF _Toc224051433 \h </w:instrText>
+              <w:instrText xml:space="preserve"> PAGEREF _Toc224314026 \h </w:instrText>
             </w:r>
             <w:r>
               <w:rPr>
@@ -587,20 +591,22 @@
             <w:pStyle w:val="TOC1"/>
             <w:tabs>
               <w:tab w:val="left" w:pos="480"/>
-              <w:tab w:val="right" w:leader="dot" w:pos="9004"/>
+              <w:tab w:val="right" w:leader="dot" w:pos="9736"/>
             </w:tabs>
             <w:rPr>
               <w:rFonts w:eastAsiaTheme="minorEastAsia" w:cstheme="minorBidi"/>
               <w:b w:val="0"/>
               <w:bCs w:val="0"/>
-              <w:caps/>
+              <w:i w:val="0"/>
+              <w:iCs w:val="0"/>
               <w:noProof/>
               <w:kern w:val="2"/>
+              <w:szCs w:val="24"/>
               <w:lang w:val="en-AE" w:eastAsia="en-US"/>
               <w14:ligatures w14:val="standardContextual"/>
             </w:rPr>
           </w:pPr>
-          <w:hyperlink w:anchor="_Toc224051434" w:history="1">
+          <w:hyperlink w:anchor="_Toc224314027" w:history="1">
             <w:r>
               <w:rPr>
                 <w:rStyle w:val="Hyperlink"/>
@@ -613,9 +619,11 @@
                 <w:rFonts w:eastAsiaTheme="minorEastAsia" w:cstheme="minorBidi"/>
                 <w:b w:val="0"/>
                 <w:bCs w:val="0"/>
-                <w:caps/>
+                <w:i w:val="0"/>
+                <w:iCs w:val="0"/>
                 <w:noProof/>
                 <w:kern w:val="2"/>
+                <w:szCs w:val="24"/>
                 <w:lang w:val="en-AE" w:eastAsia="en-US"/>
                 <w14:ligatures w14:val="standardContextual"/>
               </w:rPr>
@@ -647,7 +655,7 @@
                 <w:noProof/>
                 <w:webHidden/>
               </w:rPr>
-              <w:instrText xml:space="preserve"> PAGEREF _Toc224051434 \h </w:instrText>
+              <w:instrText xml:space="preserve"> PAGEREF _Toc224314027 \h </w:instrText>
             </w:r>
             <w:r>
               <w:rPr>
@@ -683,20 +691,22 @@
             <w:pStyle w:val="TOC1"/>
             <w:tabs>
               <w:tab w:val="left" w:pos="480"/>
-              <w:tab w:val="right" w:leader="dot" w:pos="9004"/>
+              <w:tab w:val="right" w:leader="dot" w:pos="9736"/>
             </w:tabs>
             <w:rPr>
               <w:rFonts w:eastAsiaTheme="minorEastAsia" w:cstheme="minorBidi"/>
               <w:b w:val="0"/>
               <w:bCs w:val="0"/>
-              <w:caps/>
+              <w:i w:val="0"/>
+              <w:iCs w:val="0"/>
               <w:noProof/>
               <w:kern w:val="2"/>
+              <w:szCs w:val="24"/>
               <w:lang w:val="en-AE" w:eastAsia="en-US"/>
               <w14:ligatures w14:val="standardContextual"/>
             </w:rPr>
           </w:pPr>
-          <w:hyperlink w:anchor="_Toc224051435" w:history="1">
+          <w:hyperlink w:anchor="_Toc224314028" w:history="1">
             <w:r>
               <w:rPr>
                 <w:rStyle w:val="Hyperlink"/>
@@ -709,9 +719,11 @@
                 <w:rFonts w:eastAsiaTheme="minorEastAsia" w:cstheme="minorBidi"/>
                 <w:b w:val="0"/>
                 <w:bCs w:val="0"/>
-                <w:caps/>
+                <w:i w:val="0"/>
+                <w:iCs w:val="0"/>
                 <w:noProof/>
                 <w:kern w:val="2"/>
+                <w:szCs w:val="24"/>
                 <w:lang w:val="en-AE" w:eastAsia="en-US"/>
                 <w14:ligatures w14:val="standardContextual"/>
               </w:rPr>
@@ -743,7 +755,7 @@
                 <w:noProof/>
                 <w:webHidden/>
               </w:rPr>
-              <w:instrText xml:space="preserve"> PAGEREF _Toc224051435 \h </w:instrText>
+              <w:instrText xml:space="preserve"> PAGEREF _Toc224314028 \h </w:instrText>
             </w:r>
             <w:r>
               <w:rPr>
@@ -779,20 +791,22 @@
             <w:pStyle w:val="TOC1"/>
             <w:tabs>
               <w:tab w:val="left" w:pos="480"/>
-              <w:tab w:val="right" w:leader="dot" w:pos="9004"/>
+              <w:tab w:val="right" w:leader="dot" w:pos="9736"/>
             </w:tabs>
             <w:rPr>
               <w:rFonts w:eastAsiaTheme="minorEastAsia" w:cstheme="minorBidi"/>
               <w:b w:val="0"/>
               <w:bCs w:val="0"/>
-              <w:caps/>
+              <w:i w:val="0"/>
+              <w:iCs w:val="0"/>
               <w:noProof/>
               <w:kern w:val="2"/>
+              <w:szCs w:val="24"/>
               <w:lang w:val="en-AE" w:eastAsia="en-US"/>
               <w14:ligatures w14:val="standardContextual"/>
             </w:rPr>
           </w:pPr>
-          <w:hyperlink w:anchor="_Toc224051436" w:history="1">
+          <w:hyperlink w:anchor="_Toc224314029" w:history="1">
             <w:r>
               <w:rPr>
                 <w:rStyle w:val="Hyperlink"/>
@@ -805,9 +819,11 @@
                 <w:rFonts w:eastAsiaTheme="minorEastAsia" w:cstheme="minorBidi"/>
                 <w:b w:val="0"/>
                 <w:bCs w:val="0"/>
-                <w:caps/>
+                <w:i w:val="0"/>
+                <w:iCs w:val="0"/>
                 <w:noProof/>
                 <w:kern w:val="2"/>
+                <w:szCs w:val="24"/>
                 <w:lang w:val="en-AE" w:eastAsia="en-US"/>
                 <w14:ligatures w14:val="standardContextual"/>
               </w:rPr>
@@ -839,7 +855,7 @@
                 <w:noProof/>
                 <w:webHidden/>
               </w:rPr>
-              <w:instrText xml:space="preserve"> PAGEREF _Toc224051436 \h </w:instrText>
+              <w:instrText xml:space="preserve"> PAGEREF _Toc224314029 \h </w:instrText>
             </w:r>
             <w:r>
               <w:rPr>
@@ -875,20 +891,22 @@
             <w:pStyle w:val="TOC1"/>
             <w:tabs>
               <w:tab w:val="left" w:pos="480"/>
-              <w:tab w:val="right" w:leader="dot" w:pos="9004"/>
+              <w:tab w:val="right" w:leader="dot" w:pos="9736"/>
             </w:tabs>
             <w:rPr>
               <w:rFonts w:eastAsiaTheme="minorEastAsia" w:cstheme="minorBidi"/>
               <w:b w:val="0"/>
               <w:bCs w:val="0"/>
-              <w:caps/>
+              <w:i w:val="0"/>
+              <w:iCs w:val="0"/>
               <w:noProof/>
               <w:kern w:val="2"/>
+              <w:szCs w:val="24"/>
               <w:lang w:val="en-AE" w:eastAsia="en-US"/>
               <w14:ligatures w14:val="standardContextual"/>
             </w:rPr>
           </w:pPr>
-          <w:hyperlink w:anchor="_Toc224051437" w:history="1">
+          <w:hyperlink w:anchor="_Toc224314030" w:history="1">
             <w:r>
               <w:rPr>
                 <w:rStyle w:val="Hyperlink"/>
@@ -902,9 +920,11 @@
                 <w:rFonts w:eastAsiaTheme="minorEastAsia" w:cstheme="minorBidi"/>
                 <w:b w:val="0"/>
                 <w:bCs w:val="0"/>
-                <w:caps/>
+                <w:i w:val="0"/>
+                <w:iCs w:val="0"/>
                 <w:noProof/>
                 <w:kern w:val="2"/>
+                <w:szCs w:val="24"/>
                 <w:lang w:val="en-AE" w:eastAsia="en-US"/>
                 <w14:ligatures w14:val="standardContextual"/>
               </w:rPr>
@@ -937,7 +957,7 @@
                 <w:noProof/>
                 <w:webHidden/>
               </w:rPr>
-              <w:instrText xml:space="preserve"> PAGEREF _Toc224051437 \h </w:instrText>
+              <w:instrText xml:space="preserve"> PAGEREF _Toc224314030 \h </w:instrText>
             </w:r>
             <w:r>
               <w:rPr>
@@ -973,20 +993,22 @@
             <w:pStyle w:val="TOC1"/>
             <w:tabs>
               <w:tab w:val="left" w:pos="480"/>
-              <w:tab w:val="right" w:leader="dot" w:pos="9004"/>
+              <w:tab w:val="right" w:leader="dot" w:pos="9736"/>
             </w:tabs>
             <w:rPr>
               <w:rFonts w:eastAsiaTheme="minorEastAsia" w:cstheme="minorBidi"/>
               <w:b w:val="0"/>
               <w:bCs w:val="0"/>
-              <w:caps/>
+              <w:i w:val="0"/>
+              <w:iCs w:val="0"/>
               <w:noProof/>
               <w:kern w:val="2"/>
+              <w:szCs w:val="24"/>
               <w:lang w:val="en-AE" w:eastAsia="en-US"/>
               <w14:ligatures w14:val="standardContextual"/>
             </w:rPr>
           </w:pPr>
-          <w:hyperlink w:anchor="_Toc224051438" w:history="1">
+          <w:hyperlink w:anchor="_Toc224314031" w:history="1">
             <w:r>
               <w:rPr>
                 <w:rStyle w:val="Hyperlink"/>
@@ -1000,9 +1022,11 @@
                 <w:rFonts w:eastAsiaTheme="minorEastAsia" w:cstheme="minorBidi"/>
                 <w:b w:val="0"/>
                 <w:bCs w:val="0"/>
-                <w:caps/>
+                <w:i w:val="0"/>
+                <w:iCs w:val="0"/>
                 <w:noProof/>
                 <w:kern w:val="2"/>
+                <w:szCs w:val="24"/>
                 <w:lang w:val="en-AE" w:eastAsia="en-US"/>
                 <w14:ligatures w14:val="standardContextual"/>
               </w:rPr>
@@ -1035,7 +1059,7 @@
                 <w:noProof/>
                 <w:webHidden/>
               </w:rPr>
-              <w:instrText xml:space="preserve"> PAGEREF _Toc224051438 \h </w:instrText>
+              <w:instrText xml:space="preserve"> PAGEREF _Toc224314031 \h </w:instrText>
             </w:r>
             <w:r>
               <w:rPr>
@@ -1071,20 +1095,22 @@
             <w:pStyle w:val="TOC1"/>
             <w:tabs>
               <w:tab w:val="left" w:pos="480"/>
-              <w:tab w:val="right" w:leader="dot" w:pos="9004"/>
+              <w:tab w:val="right" w:leader="dot" w:pos="9736"/>
             </w:tabs>
             <w:rPr>
               <w:rFonts w:eastAsiaTheme="minorEastAsia" w:cstheme="minorBidi"/>
               <w:b w:val="0"/>
               <w:bCs w:val="0"/>
-              <w:caps/>
+              <w:i w:val="0"/>
+              <w:iCs w:val="0"/>
               <w:noProof/>
               <w:kern w:val="2"/>
+              <w:szCs w:val="24"/>
               <w:lang w:val="en-AE" w:eastAsia="en-US"/>
               <w14:ligatures w14:val="standardContextual"/>
             </w:rPr>
           </w:pPr>
-          <w:hyperlink w:anchor="_Toc224051439" w:history="1">
+          <w:hyperlink w:anchor="_Toc224314032" w:history="1">
             <w:r>
               <w:rPr>
                 <w:rStyle w:val="Hyperlink"/>
@@ -1098,9 +1124,11 @@
                 <w:rFonts w:eastAsiaTheme="minorEastAsia" w:cstheme="minorBidi"/>
                 <w:b w:val="0"/>
                 <w:bCs w:val="0"/>
-                <w:caps/>
+                <w:i w:val="0"/>
+                <w:iCs w:val="0"/>
                 <w:noProof/>
                 <w:kern w:val="2"/>
+                <w:szCs w:val="24"/>
                 <w:lang w:val="en-AE" w:eastAsia="en-US"/>
                 <w14:ligatures w14:val="standardContextual"/>
               </w:rPr>
@@ -1133,7 +1161,7 @@
                 <w:noProof/>
                 <w:webHidden/>
               </w:rPr>
-              <w:instrText xml:space="preserve"> PAGEREF _Toc224051439 \h </w:instrText>
+              <w:instrText xml:space="preserve"> PAGEREF _Toc224314032 \h </w:instrText>
             </w:r>
             <w:r>
               <w:rPr>
@@ -1169,20 +1197,22 @@
             <w:pStyle w:val="TOC1"/>
             <w:tabs>
               <w:tab w:val="left" w:pos="480"/>
-              <w:tab w:val="right" w:leader="dot" w:pos="9004"/>
+              <w:tab w:val="right" w:leader="dot" w:pos="9736"/>
             </w:tabs>
             <w:rPr>
               <w:rFonts w:eastAsiaTheme="minorEastAsia" w:cstheme="minorBidi"/>
               <w:b w:val="0"/>
               <w:bCs w:val="0"/>
-              <w:caps/>
+              <w:i w:val="0"/>
+              <w:iCs w:val="0"/>
               <w:noProof/>
               <w:kern w:val="2"/>
+              <w:szCs w:val="24"/>
               <w:lang w:val="en-AE" w:eastAsia="en-US"/>
               <w14:ligatures w14:val="standardContextual"/>
             </w:rPr>
           </w:pPr>
-          <w:hyperlink w:anchor="_Toc224051440" w:history="1">
+          <w:hyperlink w:anchor="_Toc224314033" w:history="1">
             <w:r>
               <w:rPr>
                 <w:rStyle w:val="Hyperlink"/>
@@ -1196,9 +1226,11 @@
                 <w:rFonts w:eastAsiaTheme="minorEastAsia" w:cstheme="minorBidi"/>
                 <w:b w:val="0"/>
                 <w:bCs w:val="0"/>
-                <w:caps/>
+                <w:i w:val="0"/>
+                <w:iCs w:val="0"/>
                 <w:noProof/>
                 <w:kern w:val="2"/>
+                <w:szCs w:val="24"/>
                 <w:lang w:val="en-AE" w:eastAsia="en-US"/>
                 <w14:ligatures w14:val="standardContextual"/>
               </w:rPr>
@@ -1231,7 +1263,7 @@
                 <w:noProof/>
                 <w:webHidden/>
               </w:rPr>
-              <w:instrText xml:space="preserve"> PAGEREF _Toc224051440 \h </w:instrText>
+              <w:instrText xml:space="preserve"> PAGEREF _Toc224314033 \h </w:instrText>
             </w:r>
             <w:r>
               <w:rPr>
@@ -1251,7 +1283,7 @@
                 <w:noProof/>
                 <w:webHidden/>
               </w:rPr>
-              <w:t>vi</w:t>
+              <w:t>v</w:t>
             </w:r>
             <w:r>
               <w:rPr>
@@ -1267,20 +1299,22 @@
             <w:pStyle w:val="TOC1"/>
             <w:tabs>
               <w:tab w:val="left" w:pos="480"/>
-              <w:tab w:val="right" w:leader="dot" w:pos="9004"/>
+              <w:tab w:val="right" w:leader="dot" w:pos="9736"/>
             </w:tabs>
             <w:rPr>
               <w:rFonts w:eastAsiaTheme="minorEastAsia" w:cstheme="minorBidi"/>
               <w:b w:val="0"/>
               <w:bCs w:val="0"/>
-              <w:caps/>
+              <w:i w:val="0"/>
+              <w:iCs w:val="0"/>
               <w:noProof/>
               <w:kern w:val="2"/>
+              <w:szCs w:val="24"/>
               <w:lang w:val="en-AE" w:eastAsia="en-US"/>
               <w14:ligatures w14:val="standardContextual"/>
             </w:rPr>
           </w:pPr>
-          <w:hyperlink w:anchor="_Toc224051441" w:history="1">
+          <w:hyperlink w:anchor="_Toc224314034" w:history="1">
             <w:r>
               <w:rPr>
                 <w:rStyle w:val="Hyperlink"/>
@@ -1294,9 +1328,11 @@
                 <w:rFonts w:eastAsiaTheme="minorEastAsia" w:cstheme="minorBidi"/>
                 <w:b w:val="0"/>
                 <w:bCs w:val="0"/>
-                <w:caps/>
+                <w:i w:val="0"/>
+                <w:iCs w:val="0"/>
                 <w:noProof/>
                 <w:kern w:val="2"/>
+                <w:szCs w:val="24"/>
                 <w:lang w:val="en-AE" w:eastAsia="en-US"/>
                 <w14:ligatures w14:val="standardContextual"/>
               </w:rPr>
@@ -1329,7 +1365,7 @@
                 <w:noProof/>
                 <w:webHidden/>
               </w:rPr>
-              <w:instrText xml:space="preserve"> PAGEREF _Toc224051441 \h </w:instrText>
+              <w:instrText xml:space="preserve"> PAGEREF _Toc224314034 \h </w:instrText>
             </w:r>
             <w:r>
               <w:rPr>
@@ -1365,20 +1401,22 @@
             <w:pStyle w:val="TOC1"/>
             <w:tabs>
               <w:tab w:val="left" w:pos="720"/>
-              <w:tab w:val="right" w:leader="dot" w:pos="9004"/>
+              <w:tab w:val="right" w:leader="dot" w:pos="9736"/>
             </w:tabs>
             <w:rPr>
               <w:rFonts w:eastAsiaTheme="minorEastAsia" w:cstheme="minorBidi"/>
               <w:b w:val="0"/>
               <w:bCs w:val="0"/>
-              <w:caps/>
+              <w:i w:val="0"/>
+              <w:iCs w:val="0"/>
               <w:noProof/>
               <w:kern w:val="2"/>
+              <w:szCs w:val="24"/>
               <w:lang w:val="en-AE" w:eastAsia="en-US"/>
               <w14:ligatures w14:val="standardContextual"/>
             </w:rPr>
           </w:pPr>
-          <w:hyperlink w:anchor="_Toc224051442" w:history="1">
+          <w:hyperlink w:anchor="_Toc224314035" w:history="1">
             <w:r>
               <w:rPr>
                 <w:rStyle w:val="Hyperlink"/>
@@ -1392,9 +1430,11 @@
                 <w:rFonts w:eastAsiaTheme="minorEastAsia" w:cstheme="minorBidi"/>
                 <w:b w:val="0"/>
                 <w:bCs w:val="0"/>
-                <w:caps/>
+                <w:i w:val="0"/>
+                <w:iCs w:val="0"/>
                 <w:noProof/>
                 <w:kern w:val="2"/>
+                <w:szCs w:val="24"/>
                 <w:lang w:val="en-AE" w:eastAsia="en-US"/>
                 <w14:ligatures w14:val="standardContextual"/>
               </w:rPr>
@@ -1427,7 +1467,7 @@
                 <w:noProof/>
                 <w:webHidden/>
               </w:rPr>
-              <w:instrText xml:space="preserve"> PAGEREF _Toc224051442 \h </w:instrText>
+              <w:instrText xml:space="preserve"> PAGEREF _Toc224314035 \h </w:instrText>
             </w:r>
             <w:r>
               <w:rPr>
@@ -1479,49 +1519,38 @@
           <w:numId w:val="1"/>
         </w:numPr>
       </w:pPr>
-      <w:bookmarkStart w:id="0" w:name="_Toc224051433"/>
+      <w:bookmarkStart w:id="0" w:name="_Toc224314026"/>
       <w:r>
         <w:t>Introduction</w:t>
       </w:r>
       <w:bookmarkEnd w:id="0"/>
     </w:p>
     <w:p>
-      <w:pPr>
-        <w:rPr>
-          <w:lang w:val="en-AE" w:eastAsia="en-US"/>
-        </w:rPr>
-      </w:pPr>
-      <w:r>
-        <w:rPr>
-          <w:lang w:val="en-AE" w:eastAsia="en-US"/>
-        </w:rPr>
-        <w:t xml:space="preserve">This project presents the design and implementation of a data-driven web API for analysing English Premier League football data. The API enables users to retrieve and manipulate data related to players, teams, and matches while also providing analytical insights such as top scorers, top assist providers, league tables, and team performance summaries. </w:t>
-      </w:r>
-    </w:p>
-    <w:p>
-      <w:pPr>
-        <w:rPr>
-          <w:lang w:val="en-AE" w:eastAsia="en-US"/>
-        </w:rPr>
-      </w:pPr>
-      <w:r>
-        <w:rPr>
-          <w:lang w:val="en-AE" w:eastAsia="en-US"/>
-        </w:rPr>
-        <w:t xml:space="preserve">The system was implemented using FastAPI and integrates publicly available datasets obtained from Kaggle. The primary objective of this project was to design and implement a clean, modular RESTful API that demonstrates modern backend development practices including database integration, API design, automated testing, documentation, and version control. </w:t>
-      </w:r>
-    </w:p>
-    <w:p>
-      <w:pPr>
-        <w:rPr>
-          <w:lang w:val="en-AE" w:eastAsia="en-US"/>
-        </w:rPr>
-      </w:pPr>
-      <w:r>
-        <w:rPr>
-          <w:lang w:val="en-AE" w:eastAsia="en-US"/>
-        </w:rPr>
-        <w:t>The API exposes several endpoints that allow clients to perform CRUD operations on player data, retrieve team and match statistics, and query analytical insights derived from historical match results. The project demonstrates how web services can be used to transform raw datasets into structured, accessible data services.</w:t>
+      <w:r>
+        <w:t xml:space="preserve">This project presents the design and implementation of a RESTful web API for analysing English Premier League football data. The system enables users to retrieve structured information about players, teams, and matches while also providing analytical insights such as top goal scorers, top assist providers, league tables, and team performance summaries. </w:t>
+      </w:r>
+    </w:p>
+    <w:p>
+      <w:r>
+        <w:t xml:space="preserve">The project demonstrates how raw sports datasets can be transformed into a structured web service that allows clients to access, manipulate, and analyse football statistics through HTTP endpoints. The API was developed using </w:t>
+      </w:r>
+      <w:proofErr w:type="spellStart"/>
+      <w:r>
+        <w:t>FastAPI</w:t>
+      </w:r>
+      <w:proofErr w:type="spellEnd"/>
+      <w:r>
+        <w:t xml:space="preserve"> and integrates publicly available datasets obtained from Kaggle. </w:t>
+      </w:r>
+    </w:p>
+    <w:p>
+      <w:r>
+        <w:t xml:space="preserve">The primary goal of the project was to design a modular and well-structured backend system that demonstrates modern web service development practices. These include database integration, API design, automated testing, documentation generation, and version control. </w:t>
+      </w:r>
+    </w:p>
+    <w:p>
+      <w:r>
+        <w:t>In addition to the backend API, a lightweight front-end dashboard was developed using HTML, CSS, and JavaScript. This interface consumes the API and allows users to explore the available data through a simple browser-based interface, demonstrating how the API can be used within a client application.</w:t>
       </w:r>
     </w:p>
     <w:p>
@@ -1532,7 +1561,7 @@
           <w:numId w:val="1"/>
         </w:numPr>
       </w:pPr>
-      <w:bookmarkStart w:id="1" w:name="_Toc224051434"/>
+      <w:bookmarkStart w:id="1" w:name="_Toc224314027"/>
       <w:r>
         <w:lastRenderedPageBreak/>
         <w:t>System Architecture</w:t>
@@ -1540,94 +1569,107 @@
       <w:bookmarkEnd w:id="1"/>
     </w:p>
     <w:p>
-      <w:pPr>
-        <w:rPr>
-          <w:lang w:val="en-AE" w:eastAsia="en-US"/>
-        </w:rPr>
-      </w:pPr>
-      <w:r>
-        <w:rPr>
-          <w:lang w:val="en-AE" w:eastAsia="en-US"/>
-        </w:rPr>
-        <w:t xml:space="preserve">The system follows a modular architecture designed to ensure maintainability, scalability, and separation of concerns. The project is organised into several logical layers. </w:t>
-      </w:r>
-    </w:p>
-    <w:p>
-      <w:pPr>
-        <w:rPr>
-          <w:lang w:val="en-AE" w:eastAsia="en-US"/>
-        </w:rPr>
-      </w:pPr>
-      <w:r>
-        <w:rPr>
-          <w:lang w:val="en-AE" w:eastAsia="en-US"/>
-        </w:rPr>
-        <w:t xml:space="preserve">The router layer defines the API endpoints and handles incoming HTTP requests. Each domain of the application (players, teams, matches, and analytics) is implemented in a separate router module. This design improves readability and makes it easier to extend functionality. </w:t>
-      </w:r>
-    </w:p>
-    <w:p>
-      <w:pPr>
-        <w:rPr>
-          <w:lang w:val="en-AE" w:eastAsia="en-US"/>
-        </w:rPr>
-      </w:pPr>
-      <w:r>
-        <w:rPr>
-          <w:lang w:val="en-AE" w:eastAsia="en-US"/>
-        </w:rPr>
-        <w:t xml:space="preserve">The CRUD layer contains reusable functions responsible for interacting with the database. These functions perform operations such as retrieving players, updating records, or calculating analytics results. Separating CRUD logic from routing ensures that database operations remain reusable and easier to maintain. </w:t>
-      </w:r>
-    </w:p>
-    <w:p>
-      <w:pPr>
-        <w:rPr>
-          <w:lang w:val="en-AE" w:eastAsia="en-US"/>
-        </w:rPr>
-      </w:pPr>
-      <w:r>
-        <w:rPr>
-          <w:lang w:val="en-AE" w:eastAsia="en-US"/>
-        </w:rPr>
-        <w:t xml:space="preserve">The database layer manages the connection to the SQLite database and defines the SQLAlchemy models representing the core entities of the system. These models map Python classes to database tables and enable structured queries. </w:t>
-      </w:r>
-    </w:p>
-    <w:p>
-      <w:pPr>
-        <w:rPr>
-          <w:lang w:val="en-AE" w:eastAsia="en-US"/>
-        </w:rPr>
-      </w:pPr>
-      <w:r>
-        <w:rPr>
-          <w:lang w:val="en-AE" w:eastAsia="en-US"/>
-        </w:rPr>
-        <w:t xml:space="preserve">The schema layer uses Pydantic models to validate input data and control the structure of API responses. This ensures that all requests and responses conform to a defined schema and helps prevent invalid data from entering the system. </w:t>
-      </w:r>
-    </w:p>
-    <w:p>
-      <w:pPr>
-        <w:rPr>
-          <w:lang w:val="en-AE" w:eastAsia="en-US"/>
-        </w:rPr>
-      </w:pPr>
-      <w:r>
-        <w:rPr>
-          <w:lang w:val="en-AE" w:eastAsia="en-US"/>
-        </w:rPr>
-        <w:t xml:space="preserve">Finally, the services layer handles data ingestion tasks such as importing CSV datasets into the database. This allows the system to populate the database using real-world datasets. </w:t>
-      </w:r>
-    </w:p>
-    <w:p>
-      <w:pPr>
-        <w:rPr>
-          <w:lang w:val="en-AE" w:eastAsia="en-US"/>
-        </w:rPr>
-      </w:pPr>
-      <w:r>
-        <w:rPr>
-          <w:lang w:val="en-AE" w:eastAsia="en-US"/>
-        </w:rPr>
-        <w:t>This layered architecture ensures a clear separation between API routing, data validation, business logic, and database interaction.</w:t>
+      <w:r>
+        <w:t xml:space="preserve">The system follows a modular architecture designed to ensure separation of concerns, maintainability, and scalability. The application is structured into several logical layers that each handle a specific responsibility within the system. </w:t>
+      </w:r>
+    </w:p>
+    <w:p>
+      <w:r>
+        <w:t xml:space="preserve">The </w:t>
+      </w:r>
+      <w:r>
+        <w:rPr>
+          <w:b/>
+          <w:bCs/>
+        </w:rPr>
+        <w:t>router layer</w:t>
+      </w:r>
+      <w:r>
+        <w:t xml:space="preserve"> defines the public API endpoints and processes incoming HTTP requests. Each domain of the application, including players, teams, matches, and analytics, is implemented within a dedicated router module. This organisation improves readability and makes the API easier to extend. </w:t>
+      </w:r>
+    </w:p>
+    <w:p>
+      <w:r>
+        <w:t xml:space="preserve">The </w:t>
+      </w:r>
+      <w:r>
+        <w:rPr>
+          <w:b/>
+          <w:bCs/>
+        </w:rPr>
+        <w:t>CRUD layer</w:t>
+      </w:r>
+      <w:r>
+        <w:t xml:space="preserve"> contains reusable database operations that perform tasks such as retrieving player records, updating statistics, and executing analytical queries. Separating CRUD operations from routing logic allows the database interactions to remain modular and reusable. </w:t>
+      </w:r>
+    </w:p>
+    <w:p>
+      <w:r>
+        <w:t xml:space="preserve">The </w:t>
+      </w:r>
+      <w:r>
+        <w:rPr>
+          <w:b/>
+          <w:bCs/>
+        </w:rPr>
+        <w:t>database layer</w:t>
+      </w:r>
+      <w:r>
+        <w:t xml:space="preserve"> manages the connection to the SQLite database and defines </w:t>
+      </w:r>
+      <w:proofErr w:type="spellStart"/>
+      <w:r>
+        <w:t>SQLAlchemy</w:t>
+      </w:r>
+      <w:proofErr w:type="spellEnd"/>
+      <w:r>
+        <w:t xml:space="preserve"> models that represent the system’s core entities. These models map Python classes to relational database tables and allow structured queries to be performed efficiently.</w:t>
+      </w:r>
+    </w:p>
+    <w:p>
+      <w:r>
+        <w:t xml:space="preserve">The </w:t>
+      </w:r>
+      <w:r>
+        <w:rPr>
+          <w:b/>
+          <w:bCs/>
+        </w:rPr>
+        <w:t>schema layer</w:t>
+      </w:r>
+      <w:r>
+        <w:t xml:space="preserve"> uses </w:t>
+      </w:r>
+      <w:proofErr w:type="spellStart"/>
+      <w:r>
+        <w:t>Pydantic</w:t>
+      </w:r>
+      <w:proofErr w:type="spellEnd"/>
+      <w:r>
+        <w:t xml:space="preserve"> models to validate request data and control the structure of API responses. This ensures that incoming requests conform to the expected schema and prevents invalid data from entering the system.</w:t>
+      </w:r>
+    </w:p>
+    <w:p>
+      <w:r>
+        <w:t>Finally, the</w:t>
+      </w:r>
+      <w:r>
+        <w:t xml:space="preserve"> </w:t>
+      </w:r>
+      <w:r>
+        <w:rPr>
+          <w:b/>
+          <w:bCs/>
+        </w:rPr>
+        <w:t>services layer</w:t>
+      </w:r>
+      <w:r>
+        <w:t xml:space="preserve"> handles background tasks such as importing external datasets into the database. This allows the application to load and prepare real-world football data during setup. </w:t>
+      </w:r>
+    </w:p>
+    <w:p>
+      <w:r>
+        <w:t>This layered architecture ensures that routing, business logic, validation, and data storage remain clearly separated, which improves maintainability and simplifies future development.</w:t>
       </w:r>
     </w:p>
     <w:p>
@@ -1638,108 +1680,140 @@
           <w:numId w:val="1"/>
         </w:numPr>
       </w:pPr>
-      <w:bookmarkStart w:id="2" w:name="_Toc224051435"/>
+      <w:bookmarkStart w:id="2" w:name="_Toc224314028"/>
       <w:r>
         <w:t>Technology Stack</w:t>
       </w:r>
       <w:bookmarkEnd w:id="2"/>
     </w:p>
     <w:p>
-      <w:pPr>
-        <w:rPr>
-          <w:lang w:val="en-AE" w:eastAsia="en-US"/>
-        </w:rPr>
-      </w:pPr>
-      <w:r>
-        <w:rPr>
-          <w:lang w:val="en-AE" w:eastAsia="en-US"/>
-        </w:rPr>
-        <w:t xml:space="preserve">The API was developed using several modern technologies commonly used in backend development. </w:t>
-      </w:r>
-    </w:p>
-    <w:p>
-      <w:pPr>
-        <w:rPr>
-          <w:lang w:val="en-AE" w:eastAsia="en-US"/>
-        </w:rPr>
-      </w:pPr>
-      <w:r>
-        <w:rPr>
-          <w:lang w:val="en-AE" w:eastAsia="en-US"/>
-        </w:rPr>
-        <w:t xml:space="preserve">FastAPI was selected as the primary backend framework. It offers high performance, built-in request validation, automatic OpenAPI documentation generation, and a clean development workflow. FastAPI also integrates well with Pydantic and SQLAlchemy, making it a suitable framework for data-driven APIs. </w:t>
-      </w:r>
-    </w:p>
-    <w:p>
-      <w:pPr>
-        <w:rPr>
-          <w:lang w:val="en-AE" w:eastAsia="en-US"/>
-        </w:rPr>
-      </w:pPr>
-      <w:r>
-        <w:rPr>
-          <w:lang w:val="en-AE" w:eastAsia="en-US"/>
-        </w:rPr>
-        <w:t xml:space="preserve">SQLite was used as the relational database for this project. SQLite is lightweight, easy to configure, and suitable for smaller-scale applications and coursework projects. It allows the API to store and retrieve structured data efficiently. </w:t>
-      </w:r>
-    </w:p>
-    <w:p>
-      <w:pPr>
-        <w:rPr>
-          <w:lang w:val="en-AE" w:eastAsia="en-US"/>
-        </w:rPr>
-      </w:pPr>
-      <w:r>
-        <w:rPr>
-          <w:lang w:val="en-AE" w:eastAsia="en-US"/>
+      <w:r>
+        <w:t xml:space="preserve">Several modern technologies were used to implement the API. </w:t>
+      </w:r>
+    </w:p>
+    <w:p>
+      <w:proofErr w:type="spellStart"/>
+      <w:r>
+        <w:rPr>
+          <w:b/>
+          <w:bCs/>
+        </w:rPr>
+        <w:t>FastAPI</w:t>
+      </w:r>
+      <w:proofErr w:type="spellEnd"/>
+      <w:r>
+        <w:t xml:space="preserve"> was selected as the backend framework due to its high performance, automatic </w:t>
+      </w:r>
+      <w:proofErr w:type="spellStart"/>
+      <w:r>
+        <w:t>OpenAPI</w:t>
+      </w:r>
+      <w:proofErr w:type="spellEnd"/>
+      <w:r>
+        <w:t xml:space="preserve"> documentation generation, and strong integration with Python typing and </w:t>
+      </w:r>
+      <w:proofErr w:type="spellStart"/>
+      <w:r>
+        <w:t>Pydantic</w:t>
+      </w:r>
+      <w:proofErr w:type="spellEnd"/>
+      <w:r>
+        <w:t xml:space="preserve"> validation models. </w:t>
+      </w:r>
+      <w:proofErr w:type="spellStart"/>
+      <w:r>
+        <w:t>FastAPI</w:t>
+      </w:r>
+      <w:proofErr w:type="spellEnd"/>
+      <w:r>
+        <w:t xml:space="preserve"> also provides an intuitive development workflow that simplifies the creation of RESTful APIs. </w:t>
+      </w:r>
+    </w:p>
+    <w:p>
+      <w:r>
+        <w:rPr>
+          <w:b/>
+          <w:bCs/>
+        </w:rPr>
+        <w:t>SQLite</w:t>
+      </w:r>
+      <w:r>
+        <w:t xml:space="preserve"> was chosen as the relational database for this project. SQLite is lightweight and requires minimal configuration, making it suitable for coursework projects and small-scale applications. </w:t>
+      </w:r>
+    </w:p>
+    <w:p>
+      <w:proofErr w:type="spellStart"/>
+      <w:r>
+        <w:rPr>
+          <w:b/>
+          <w:bCs/>
         </w:rPr>
         <w:lastRenderedPageBreak/>
-        <w:t xml:space="preserve">SQLAlchemy was used as the Object Relational Mapping (ORM) library. It enables developers to interact with the database using Python objects instead of raw SQL queries. This improves readability and maintainability of the database logic. </w:t>
-      </w:r>
-    </w:p>
-    <w:p>
-      <w:pPr>
-        <w:rPr>
-          <w:lang w:val="en-AE" w:eastAsia="en-US"/>
-        </w:rPr>
-      </w:pPr>
-      <w:r>
-        <w:rPr>
-          <w:lang w:val="en-AE" w:eastAsia="en-US"/>
-        </w:rPr>
-        <w:t xml:space="preserve">Pydantic was used to define data schemas and perform input validation. Pydantic ensures that all incoming requests conform to the expected data structure and that API responses follow a consistent format. </w:t>
-      </w:r>
-    </w:p>
-    <w:p>
-      <w:pPr>
-        <w:rPr>
-          <w:lang w:val="en-AE" w:eastAsia="en-US"/>
-        </w:rPr>
-      </w:pPr>
-      <w:r>
-        <w:rPr>
-          <w:lang w:val="en-AE" w:eastAsia="en-US"/>
-        </w:rPr>
-        <w:t>Pytest was used to implement automated testing for the API. Automated tests verify that endpoints behave correctly and help detect issues during development.</w:t>
-      </w:r>
-    </w:p>
-    <w:p>
-      <w:pPr>
-        <w:rPr>
-          <w:lang w:val="en-AE" w:eastAsia="en-US"/>
-        </w:rPr>
-      </w:pPr>
-      <w:r>
-        <w:rPr>
-          <w:lang w:val="en-AE" w:eastAsia="en-US"/>
-        </w:rPr>
-        <w:t>Swagger/OpenAPI documentation is automatically generated by FastAPI, allowing users to explore and test the API endpoints through a browser-based interfac</w:t>
-      </w:r>
-      <w:r>
-        <w:rPr>
-          <w:lang w:val="en-AE" w:eastAsia="en-US"/>
-        </w:rPr>
-        <w:t>e.</w:t>
+        <w:t>SQLAlchemy</w:t>
+      </w:r>
+      <w:proofErr w:type="spellEnd"/>
+      <w:r>
+        <w:t xml:space="preserve"> was used as the Object Relational Mapping (ORM) library. It allows database operations to be performed using Python objects instead of raw SQL queries. This improves code readability and maintainability while still allowing complex queries to be executed efficiently. </w:t>
+      </w:r>
+    </w:p>
+    <w:p>
+      <w:proofErr w:type="spellStart"/>
+      <w:r>
+        <w:rPr>
+          <w:b/>
+          <w:bCs/>
+        </w:rPr>
+        <w:t>Pydantic</w:t>
+      </w:r>
+      <w:proofErr w:type="spellEnd"/>
+      <w:r>
+        <w:t xml:space="preserve"> was used to define request and response schemas. It performs automatic data validation and ensures that API responses follow a consistent structure. </w:t>
+      </w:r>
+    </w:p>
+    <w:p>
+      <w:proofErr w:type="spellStart"/>
+      <w:r>
+        <w:rPr>
+          <w:b/>
+          <w:bCs/>
+        </w:rPr>
+        <w:t>Pytest</w:t>
+      </w:r>
+      <w:proofErr w:type="spellEnd"/>
+      <w:r>
+        <w:t xml:space="preserve"> was used to implement automated testing for the API. Automated tests verify that endpoints behave correctly and help detect issues during development. </w:t>
+      </w:r>
+    </w:p>
+    <w:p>
+      <w:proofErr w:type="spellStart"/>
+      <w:r>
+        <w:t>FastAPI</w:t>
+      </w:r>
+      <w:proofErr w:type="spellEnd"/>
+      <w:r>
+        <w:t xml:space="preserve"> automatically generates interactive API documentation through </w:t>
+      </w:r>
+      <w:r>
+        <w:rPr>
+          <w:b/>
+          <w:bCs/>
+        </w:rPr>
+        <w:t>Swagger UI</w:t>
+      </w:r>
+      <w:r>
+        <w:t xml:space="preserve"> and </w:t>
+      </w:r>
+      <w:proofErr w:type="spellStart"/>
+      <w:r>
+        <w:rPr>
+          <w:b/>
+          <w:bCs/>
+        </w:rPr>
+        <w:t>ReDoc</w:t>
+      </w:r>
+      <w:proofErr w:type="spellEnd"/>
+      <w:r>
+        <w:t>, allowing developers to explore and test the API through a browser interface.</w:t>
       </w:r>
     </w:p>
     <w:p>
@@ -1750,75 +1824,125 @@
           <w:numId w:val="1"/>
         </w:numPr>
       </w:pPr>
-      <w:bookmarkStart w:id="3" w:name="_Toc224051436"/>
+      <w:bookmarkStart w:id="3" w:name="_Toc224314029"/>
       <w:r>
         <w:t>Database Design</w:t>
       </w:r>
       <w:bookmarkEnd w:id="3"/>
     </w:p>
     <w:p>
-      <w:pPr>
-        <w:rPr>
-          <w:lang w:val="en-AE" w:eastAsia="en-US"/>
-        </w:rPr>
-      </w:pPr>
-      <w:r>
-        <w:rPr>
-          <w:lang w:val="en-AE" w:eastAsia="en-US"/>
-        </w:rPr>
-        <w:t xml:space="preserve">The database schema consists of three primary tables: Teams, Players, and Matches. </w:t>
-      </w:r>
-    </w:p>
-    <w:p>
-      <w:pPr>
-        <w:rPr>
-          <w:lang w:val="en-AE" w:eastAsia="en-US"/>
-        </w:rPr>
-      </w:pPr>
-      <w:r>
-        <w:rPr>
-          <w:lang w:val="en-AE" w:eastAsia="en-US"/>
-        </w:rPr>
-        <w:t xml:space="preserve">The Teams table stores information about football clubs participating in the Premier League. Each team has a unique identifier and name. </w:t>
-      </w:r>
-    </w:p>
-    <w:p>
-      <w:pPr>
-        <w:rPr>
-          <w:lang w:val="en-AE" w:eastAsia="en-US"/>
-        </w:rPr>
-      </w:pPr>
-      <w:r>
-        <w:rPr>
-          <w:lang w:val="en-AE" w:eastAsia="en-US"/>
-        </w:rPr>
-        <w:t xml:space="preserve">The Players table stores player statistics including appearances, minutes played, goals, assists, and playing position. Each player is associated with a team through a foreign key relationship linking the Players table to the Teams table. </w:t>
-      </w:r>
-    </w:p>
-    <w:p>
-      <w:pPr>
-        <w:rPr>
-          <w:lang w:val="en-AE" w:eastAsia="en-US"/>
-        </w:rPr>
-      </w:pPr>
-      <w:r>
-        <w:rPr>
-          <w:lang w:val="en-AE" w:eastAsia="en-US"/>
-        </w:rPr>
-        <w:t xml:space="preserve">The Matches table stores match-level statistics including the home and away teams, goals scored, shots, corners, fouls, and disciplinary records. Each match references two teams through foreign keys representing the home team and away team. </w:t>
-      </w:r>
-    </w:p>
-    <w:p>
-      <w:pPr>
-        <w:rPr>
-          <w:lang w:val="en-AE" w:eastAsia="en-US"/>
-        </w:rPr>
-      </w:pPr>
-      <w:r>
-        <w:rPr>
-          <w:lang w:val="en-AE" w:eastAsia="en-US"/>
-        </w:rPr>
-        <w:t>This relational design enables efficient querying and supports analytical operations such as calculating league standings, identifying top scorers, and analysing match outcomes.</w:t>
+      <w:r>
+        <w:t xml:space="preserve">The database schema consists of three primary entities: </w:t>
+      </w:r>
+      <w:r>
+        <w:rPr>
+          <w:b/>
+          <w:bCs/>
+        </w:rPr>
+        <w:t>Teams</w:t>
+      </w:r>
+      <w:r>
+        <w:t xml:space="preserve">, </w:t>
+      </w:r>
+      <w:r>
+        <w:rPr>
+          <w:b/>
+          <w:bCs/>
+        </w:rPr>
+        <w:t>Players</w:t>
+      </w:r>
+      <w:r>
+        <w:t xml:space="preserve">, and </w:t>
+      </w:r>
+      <w:r>
+        <w:rPr>
+          <w:b/>
+          <w:bCs/>
+        </w:rPr>
+        <w:t>Matches</w:t>
+      </w:r>
+      <w:r>
+        <w:t xml:space="preserve">. </w:t>
+      </w:r>
+    </w:p>
+    <w:p>
+      <w:r>
+        <w:t xml:space="preserve">The </w:t>
+      </w:r>
+      <w:r>
+        <w:rPr>
+          <w:b/>
+          <w:bCs/>
+        </w:rPr>
+        <w:t>Teams</w:t>
+      </w:r>
+      <w:r>
+        <w:t xml:space="preserve"> </w:t>
+      </w:r>
+      <w:r>
+        <w:rPr>
+          <w:b/>
+          <w:bCs/>
+        </w:rPr>
+        <w:t>table</w:t>
+      </w:r>
+      <w:r>
+        <w:t xml:space="preserve"> stores information about football clubs participating in the Premier League. Each team is assigned a unique identifier and name. </w:t>
+      </w:r>
+    </w:p>
+    <w:p>
+      <w:r>
+        <w:t xml:space="preserve">The </w:t>
+      </w:r>
+      <w:r>
+        <w:rPr>
+          <w:b/>
+          <w:bCs/>
+        </w:rPr>
+        <w:t>Players</w:t>
+      </w:r>
+      <w:r>
+        <w:t xml:space="preserve"> </w:t>
+      </w:r>
+      <w:r>
+        <w:rPr>
+          <w:b/>
+          <w:bCs/>
+        </w:rPr>
+        <w:t>table</w:t>
+      </w:r>
+      <w:r>
+        <w:t xml:space="preserve"> stores player statistics including appearances, minutes played, goals, assists, and playing position. Each player record is associated with a team through a foreign key relationship linking the Players table to the Teams table. </w:t>
+      </w:r>
+    </w:p>
+    <w:p>
+      <w:r>
+        <w:t xml:space="preserve">The </w:t>
+      </w:r>
+      <w:r>
+        <w:rPr>
+          <w:b/>
+          <w:bCs/>
+        </w:rPr>
+        <w:t>Matches</w:t>
+      </w:r>
+      <w:r>
+        <w:t xml:space="preserve"> </w:t>
+      </w:r>
+      <w:r>
+        <w:rPr>
+          <w:b/>
+          <w:bCs/>
+        </w:rPr>
+        <w:t>table</w:t>
+      </w:r>
+      <w:r>
+        <w:t xml:space="preserve"> stores match-level statistics including home and away teams, goals scored, shots, fouls, corners, and disciplinary records. Each match references two teams through foreign keys representing the home and away teams. </w:t>
+      </w:r>
+    </w:p>
+    <w:p>
+      <w:r>
+        <w:t>This relational design enables efficient querying and supports analytical operations such as calculating league tables, identifying top scorers, and analysing match outcomes.</w:t>
       </w:r>
     </w:p>
     <w:p>
@@ -1832,7 +1956,7 @@
           <w:lang w:val="en-AE" w:eastAsia="en-US"/>
         </w:rPr>
       </w:pPr>
-      <w:bookmarkStart w:id="4" w:name="_Toc224051437"/>
+      <w:bookmarkStart w:id="4" w:name="_Toc224314030"/>
       <w:r>
         <w:rPr>
           <w:lang w:val="en-AE" w:eastAsia="en-US"/>
@@ -1851,7 +1975,7 @@
         <w:rPr>
           <w:lang w:val="en-AE" w:eastAsia="en-US"/>
         </w:rPr>
-        <w:t>Two publicly available datasets from Kaggle were used to populate the database.</w:t>
+        <w:t xml:space="preserve">Two publicly available datasets from Kaggle were used to populate the database. </w:t>
       </w:r>
     </w:p>
     <w:p>
@@ -1877,47 +2001,40 @@
         <w:rPr>
           <w:lang w:val="en-AE" w:eastAsia="en-US"/>
         </w:rPr>
-        <w:t xml:space="preserve">The second dataset contains player statistics for the 2024/25 season. This dataset includes player appearances, minutes played, goals, assists, and playing positions. </w:t>
-      </w:r>
-    </w:p>
-    <w:p>
-      <w:pPr>
-        <w:rPr>
-          <w:lang w:val="en-AE" w:eastAsia="en-US"/>
-        </w:rPr>
-      </w:pPr>
+        <w:t xml:space="preserve">The second dataset contains player statistics for the 2024/25 season, including appearances, minutes played, goals, assists, and playing positions. </w:t>
+      </w:r>
+    </w:p>
+    <w:p>
+      <w:pPr>
+        <w:rPr>
+          <w:lang w:val="en-AE" w:eastAsia="en-US"/>
+        </w:rPr>
+      </w:pPr>
+      <w:r>
+        <w:rPr>
+          <w:lang w:val="en-AE" w:eastAsia="en-US"/>
+        </w:rPr>
+        <w:t xml:space="preserve">A custom data import script was implemented to load the CSV datasets into the database. During the import process, unique teams were first extracted and inserted into the Teams </w:t>
+      </w:r>
       <w:r>
         <w:rPr>
           <w:lang w:val="en-AE" w:eastAsia="en-US"/>
         </w:rPr>
         <w:lastRenderedPageBreak/>
-        <w:t xml:space="preserve">A custom data import script was implemented to load the datasets into the database. The script reads the CSV files using Python and inserts the data into the Teams, Players, and Matches tables. </w:t>
-      </w:r>
-    </w:p>
-    <w:p>
-      <w:pPr>
-        <w:rPr>
-          <w:lang w:val="en-AE" w:eastAsia="en-US"/>
-        </w:rPr>
-      </w:pPr>
-      <w:r>
-        <w:rPr>
-          <w:lang w:val="en-AE" w:eastAsia="en-US"/>
-        </w:rPr>
-        <w:t xml:space="preserve">During the import process, unique teams were extracted from both datasets and inserted into the Teams table before importing players and matches. This ensured that foreign key relationships were correctly maintained. </w:t>
-      </w:r>
-    </w:p>
-    <w:p>
-      <w:pPr>
-        <w:rPr>
-          <w:lang w:val="en-AE" w:eastAsia="en-US"/>
-        </w:rPr>
-      </w:pPr>
-      <w:r>
-        <w:rPr>
-          <w:lang w:val="en-AE" w:eastAsia="en-US"/>
-        </w:rPr>
-        <w:t>Using real-world datasets allowed the project to demonstrate realistic API behaviour and enabled the development of meaningful analytics endpoints.</w:t>
+        <w:t xml:space="preserve">table before importing players and matches. This ensured that foreign key relationships between tables were correctly maintained. </w:t>
+      </w:r>
+    </w:p>
+    <w:p>
+      <w:pPr>
+        <w:rPr>
+          <w:lang w:val="en-AE" w:eastAsia="en-US"/>
+        </w:rPr>
+      </w:pPr>
+      <w:r>
+        <w:rPr>
+          <w:lang w:val="en-AE" w:eastAsia="en-US"/>
+        </w:rPr>
+        <w:t>Using real-world datasets allowed the API to provide meaningful analytics and realistic query results.</w:t>
       </w:r>
     </w:p>
     <w:p>
@@ -1931,7 +2048,7 @@
           <w:lang w:val="en-AE" w:eastAsia="en-US"/>
         </w:rPr>
       </w:pPr>
-      <w:bookmarkStart w:id="5" w:name="_Toc224051438"/>
+      <w:bookmarkStart w:id="5" w:name="_Toc224314031"/>
       <w:r>
         <w:rPr>
           <w:lang w:val="en-AE" w:eastAsia="en-US"/>
@@ -1950,72 +2067,184 @@
         <w:rPr>
           <w:lang w:val="en-AE" w:eastAsia="en-US"/>
         </w:rPr>
-        <w:t>The API follows REST principles and exposes endpoints grouped by resource type.</w:t>
-      </w:r>
-    </w:p>
-    <w:p>
-      <w:pPr>
-        <w:rPr>
-          <w:lang w:val="en-AE" w:eastAsia="en-US"/>
-        </w:rPr>
-      </w:pPr>
-      <w:r>
-        <w:rPr>
-          <w:lang w:val="en-AE" w:eastAsia="en-US"/>
-        </w:rPr>
-        <w:t>Player endpoints provide full CRUD functionality. Users can create, retrieve, update, and delete player records. This satisfies the minimum requirement of implementing a data model with full CRUD functionality linked to a database</w:t>
-      </w:r>
-    </w:p>
-    <w:p>
-      <w:pPr>
-        <w:rPr>
-          <w:lang w:val="en-AE" w:eastAsia="en-US"/>
-        </w:rPr>
-      </w:pPr>
-      <w:r>
-        <w:rPr>
-          <w:lang w:val="en-AE" w:eastAsia="en-US"/>
-        </w:rPr>
-        <w:t xml:space="preserve">Team endpoints allow retrieval of team information. </w:t>
-      </w:r>
-    </w:p>
-    <w:p>
-      <w:pPr>
-        <w:rPr>
-          <w:lang w:val="en-AE" w:eastAsia="en-US"/>
-        </w:rPr>
-      </w:pPr>
-      <w:r>
-        <w:rPr>
-          <w:lang w:val="en-AE" w:eastAsia="en-US"/>
-        </w:rPr>
-        <w:t xml:space="preserve">Match endpoints provide access to match statistics and support filtering by season or team identifier. </w:t>
-      </w:r>
-    </w:p>
-    <w:p>
-      <w:pPr>
-        <w:rPr>
-          <w:lang w:val="en-AE" w:eastAsia="en-US"/>
-        </w:rPr>
-      </w:pPr>
-      <w:r>
-        <w:rPr>
-          <w:lang w:val="en-AE" w:eastAsia="en-US"/>
-        </w:rPr>
-        <w:t xml:space="preserve">In addition to basic CRUD functionality, the API also includes analytical endpoints. These endpoints calculate insights based on the stored data. Examples include retrieving top scorers, top assist providers, highest scoring matches, league tables for a specific season, and team performance summaries. </w:t>
-      </w:r>
-    </w:p>
-    <w:p>
-      <w:pPr>
-        <w:rPr>
-          <w:lang w:val="en-AE" w:eastAsia="en-US"/>
-        </w:rPr>
-      </w:pPr>
-      <w:r>
-        <w:rPr>
-          <w:lang w:val="en-AE" w:eastAsia="en-US"/>
-        </w:rPr>
-        <w:t>All endpoints return JSON responses and follow standard HTTP status code conventions. For example, successful requests return status code 200, newly created resources return 201, and invalid requests return appropriate error codes.</w:t>
+        <w:t xml:space="preserve">The API follows RESTful design principles and exposes endpoints grouped by resource type. </w:t>
+      </w:r>
+    </w:p>
+    <w:p>
+      <w:pPr>
+        <w:rPr>
+          <w:lang w:val="en-AE" w:eastAsia="en-US"/>
+        </w:rPr>
+      </w:pPr>
+      <w:r>
+        <w:rPr>
+          <w:lang w:val="en-AE" w:eastAsia="en-US"/>
+        </w:rPr>
+        <w:t xml:space="preserve">The </w:t>
+      </w:r>
+      <w:r>
+        <w:rPr>
+          <w:b/>
+          <w:bCs/>
+          <w:lang w:val="en-AE" w:eastAsia="en-US"/>
+        </w:rPr>
+        <w:t>Players</w:t>
+      </w:r>
+      <w:r>
+        <w:rPr>
+          <w:lang w:val="en-AE" w:eastAsia="en-US"/>
+        </w:rPr>
+        <w:t xml:space="preserve"> </w:t>
+      </w:r>
+      <w:r>
+        <w:rPr>
+          <w:b/>
+          <w:bCs/>
+          <w:lang w:val="en-AE" w:eastAsia="en-US"/>
+        </w:rPr>
+        <w:t>resource</w:t>
+      </w:r>
+      <w:r>
+        <w:rPr>
+          <w:lang w:val="en-AE" w:eastAsia="en-US"/>
+        </w:rPr>
+        <w:t xml:space="preserve"> provides full CRUD functionality. Users can create, retrieve, update, and delete player records through standard HTTP methods. This satisfies the requirement of implementing a data model with full database-backed CRUD functionality. </w:t>
+      </w:r>
+    </w:p>
+    <w:p>
+      <w:pPr>
+        <w:rPr>
+          <w:lang w:val="en-AE" w:eastAsia="en-US"/>
+        </w:rPr>
+      </w:pPr>
+      <w:r>
+        <w:rPr>
+          <w:lang w:val="en-AE" w:eastAsia="en-US"/>
+        </w:rPr>
+        <w:t xml:space="preserve">The </w:t>
+      </w:r>
+      <w:r>
+        <w:rPr>
+          <w:b/>
+          <w:bCs/>
+          <w:lang w:val="en-AE" w:eastAsia="en-US"/>
+        </w:rPr>
+        <w:t>Teams</w:t>
+      </w:r>
+      <w:r>
+        <w:rPr>
+          <w:lang w:val="en-AE" w:eastAsia="en-US"/>
+        </w:rPr>
+        <w:t xml:space="preserve"> </w:t>
+      </w:r>
+      <w:r>
+        <w:rPr>
+          <w:b/>
+          <w:bCs/>
+          <w:lang w:val="en-AE" w:eastAsia="en-US"/>
+        </w:rPr>
+        <w:t>resource</w:t>
+      </w:r>
+      <w:r>
+        <w:rPr>
+          <w:lang w:val="en-AE" w:eastAsia="en-US"/>
+        </w:rPr>
+        <w:t xml:space="preserve"> allows retrieval of team information and associated data. </w:t>
+      </w:r>
+    </w:p>
+    <w:p>
+      <w:pPr>
+        <w:rPr>
+          <w:lang w:val="en-AE" w:eastAsia="en-US"/>
+        </w:rPr>
+      </w:pPr>
+      <w:r>
+        <w:rPr>
+          <w:lang w:val="en-AE" w:eastAsia="en-US"/>
+        </w:rPr>
+        <w:t xml:space="preserve">The </w:t>
+      </w:r>
+      <w:r>
+        <w:rPr>
+          <w:b/>
+          <w:bCs/>
+          <w:lang w:val="en-AE" w:eastAsia="en-US"/>
+        </w:rPr>
+        <w:t>Matches</w:t>
+      </w:r>
+      <w:r>
+        <w:rPr>
+          <w:lang w:val="en-AE" w:eastAsia="en-US"/>
+        </w:rPr>
+        <w:t xml:space="preserve"> </w:t>
+      </w:r>
+      <w:r>
+        <w:rPr>
+          <w:b/>
+          <w:bCs/>
+          <w:lang w:val="en-AE" w:eastAsia="en-US"/>
+        </w:rPr>
+        <w:t>resource</w:t>
+      </w:r>
+      <w:r>
+        <w:rPr>
+          <w:lang w:val="en-AE" w:eastAsia="en-US"/>
+        </w:rPr>
+        <w:t xml:space="preserve"> provides access to match statistics and supports filtering by season or team identifier. </w:t>
+      </w:r>
+    </w:p>
+    <w:p>
+      <w:pPr>
+        <w:rPr>
+          <w:lang w:val="en-AE" w:eastAsia="en-US"/>
+        </w:rPr>
+      </w:pPr>
+      <w:r>
+        <w:rPr>
+          <w:lang w:val="en-AE" w:eastAsia="en-US"/>
+        </w:rPr>
+        <w:t xml:space="preserve">In addition to basic CRUD functionality, the API includes several </w:t>
+      </w:r>
+      <w:r>
+        <w:rPr>
+          <w:b/>
+          <w:bCs/>
+          <w:lang w:val="en-AE" w:eastAsia="en-US"/>
+        </w:rPr>
+        <w:t>analytical</w:t>
+      </w:r>
+      <w:r>
+        <w:rPr>
+          <w:lang w:val="en-AE" w:eastAsia="en-US"/>
+        </w:rPr>
+        <w:t xml:space="preserve"> </w:t>
+      </w:r>
+      <w:r>
+        <w:rPr>
+          <w:b/>
+          <w:bCs/>
+          <w:lang w:val="en-AE" w:eastAsia="en-US"/>
+        </w:rPr>
+        <w:t>endpoints</w:t>
+      </w:r>
+      <w:r>
+        <w:rPr>
+          <w:lang w:val="en-AE" w:eastAsia="en-US"/>
+        </w:rPr>
+        <w:t xml:space="preserve">. These endpoints compute insights derived from stored match and player data. Examples include retrieving top goal scorers, top assist providers, highest scoring matches, league tables for a specific season, and team performance summaries. </w:t>
+      </w:r>
+    </w:p>
+    <w:p>
+      <w:pPr>
+        <w:rPr>
+          <w:lang w:val="en-AE" w:eastAsia="en-US"/>
+        </w:rPr>
+      </w:pPr>
+      <w:r>
+        <w:rPr>
+          <w:lang w:val="en-AE" w:eastAsia="en-US"/>
+        </w:rPr>
+        <w:t>All endpoints return structured JSON responses and follow standard HTTP status code conventions such as 200 for successful requests and 201 for newly created resources.</w:t>
       </w:r>
     </w:p>
     <w:p>
@@ -2029,7 +2258,7 @@
           <w:lang w:val="en-AE" w:eastAsia="en-US"/>
         </w:rPr>
       </w:pPr>
-      <w:bookmarkStart w:id="6" w:name="_Toc224051439"/>
+      <w:bookmarkStart w:id="6" w:name="_Toc224314032"/>
       <w:r>
         <w:rPr>
           <w:lang w:val="en-AE" w:eastAsia="en-US"/>
@@ -2048,59 +2277,33 @@
         <w:rPr>
           <w:lang w:val="en-AE" w:eastAsia="en-US"/>
         </w:rPr>
-        <w:t xml:space="preserve">Automated testing was implemented using Pytest to ensure that the API behaves as expected. </w:t>
-      </w:r>
-    </w:p>
-    <w:p>
-      <w:pPr>
-        <w:rPr>
-          <w:lang w:val="en-AE" w:eastAsia="en-US"/>
-        </w:rPr>
-      </w:pPr>
-      <w:r>
-        <w:rPr>
-          <w:lang w:val="en-AE" w:eastAsia="en-US"/>
-        </w:rPr>
-        <w:t xml:space="preserve">Tests were written to verify several key functionalities including player CRUD operations, team retrieval endpoints, match retrieval endpoints, and analytics endpoints. </w:t>
-      </w:r>
-    </w:p>
-    <w:p>
-      <w:pPr>
-        <w:rPr>
-          <w:lang w:val="en-AE" w:eastAsia="en-US"/>
-        </w:rPr>
-      </w:pPr>
-      <w:r>
-        <w:rPr>
-          <w:lang w:val="en-AE" w:eastAsia="en-US"/>
-        </w:rPr>
-        <w:t xml:space="preserve">The test suite also verifies that the root API endpoint returns the expected response. </w:t>
-      </w:r>
-    </w:p>
-    <w:p>
-      <w:pPr>
-        <w:rPr>
-          <w:lang w:val="en-AE" w:eastAsia="en-US"/>
-        </w:rPr>
-      </w:pPr>
-      <w:r>
-        <w:rPr>
-          <w:lang w:val="en-AE" w:eastAsia="en-US"/>
-        </w:rPr>
-        <w:lastRenderedPageBreak/>
-        <w:t>Automated tests help ensure that changes to the code do not break existing</w:t>
-      </w:r>
-      <w:r>
-        <w:rPr>
-          <w:lang w:val="en-AE" w:eastAsia="en-US"/>
-        </w:rPr>
-        <w:t xml:space="preserve"> </w:t>
-      </w:r>
-      <w:r>
-        <w:rPr>
-          <w:lang w:val="en-AE" w:eastAsia="en-US"/>
-        </w:rPr>
-        <w:t>functionality and provide confidence that the API behaves correctly under different scenarios.</w:t>
+        <w:t xml:space="preserve">Automated testing was implemented using Pytest to verify that the API behaves correctly. </w:t>
+      </w:r>
+    </w:p>
+    <w:p>
+      <w:pPr>
+        <w:rPr>
+          <w:lang w:val="en-AE" w:eastAsia="en-US"/>
+        </w:rPr>
+      </w:pPr>
+      <w:r>
+        <w:rPr>
+          <w:lang w:val="en-AE" w:eastAsia="en-US"/>
+        </w:rPr>
+        <w:t xml:space="preserve">Tests were written to validate player CRUD operations, team retrieval endpoints, match retrieval endpoints, and analytical endpoints. </w:t>
+      </w:r>
+    </w:p>
+    <w:p>
+      <w:pPr>
+        <w:rPr>
+          <w:lang w:val="en-AE" w:eastAsia="en-US"/>
+        </w:rPr>
+      </w:pPr>
+      <w:r>
+        <w:rPr>
+          <w:lang w:val="en-AE" w:eastAsia="en-US"/>
+        </w:rPr>
+        <w:t>Automated testing ensures that the API functions as expected and helps detect issues when changes are introduced.</w:t>
       </w:r>
     </w:p>
     <w:p>
@@ -2114,7 +2317,7 @@
           <w:lang w:val="en-AE" w:eastAsia="en-US"/>
         </w:rPr>
       </w:pPr>
-      <w:bookmarkStart w:id="7" w:name="_Toc224051440"/>
+      <w:bookmarkStart w:id="7" w:name="_Toc224314033"/>
       <w:r>
         <w:rPr>
           <w:lang w:val="en-AE" w:eastAsia="en-US"/>
@@ -2133,70 +2336,34 @@
         <w:rPr>
           <w:lang w:val="en-AE" w:eastAsia="en-US"/>
         </w:rPr>
-        <w:t xml:space="preserve">One challenge encountered during development involved aligning SQLAlchemy database models with Pydantic response schemas. This required enabling Pydantic support for ORM objects using the </w:t>
-      </w:r>
-      <w:r>
-        <w:rPr>
-          <w:lang w:val="en-AE" w:eastAsia="en-US"/>
-        </w:rPr>
-        <w:t>‘</w:t>
-      </w:r>
-      <w:r>
-        <w:rPr>
-          <w:lang w:val="en-AE" w:eastAsia="en-US"/>
-        </w:rPr>
-        <w:t>from_attributes</w:t>
-      </w:r>
-      <w:r>
-        <w:rPr>
-          <w:lang w:val="en-AE" w:eastAsia="en-US"/>
-        </w:rPr>
-        <w:t>’</w:t>
-      </w:r>
-      <w:r>
-        <w:rPr>
-          <w:lang w:val="en-AE" w:eastAsia="en-US"/>
-        </w:rPr>
-        <w:t xml:space="preserve"> configuration. </w:t>
-      </w:r>
-    </w:p>
-    <w:p>
-      <w:pPr>
-        <w:rPr>
-          <w:lang w:val="en-AE" w:eastAsia="en-US"/>
-        </w:rPr>
-      </w:pPr>
-      <w:r>
-        <w:rPr>
-          <w:lang w:val="en-AE" w:eastAsia="en-US"/>
-        </w:rPr>
-        <w:t xml:space="preserve">Another challenge involved importing large datasets and ensuring that teams referenced by players and matches were correctly inserted into the database before importing related records. </w:t>
-      </w:r>
-    </w:p>
-    <w:p>
-      <w:pPr>
-        <w:rPr>
-          <w:lang w:val="en-AE" w:eastAsia="en-US"/>
-        </w:rPr>
-      </w:pPr>
-      <w:r>
-        <w:rPr>
-          <w:lang w:val="en-AE" w:eastAsia="en-US"/>
-        </w:rPr>
-        <w:t xml:space="preserve">Designing analytical endpoints also required careful aggregation of match data to compute league tables and performance summaries. </w:t>
-      </w:r>
-    </w:p>
-    <w:p>
-      <w:pPr>
-        <w:rPr>
-          <w:lang w:val="en-AE" w:eastAsia="en-US"/>
-        </w:rPr>
-      </w:pPr>
-      <w:r>
-        <w:rPr>
-          <w:lang w:val="en-AE" w:eastAsia="en-US"/>
-        </w:rPr>
-        <w:t>Through this project, several important lessons were learned regarding API architecture, database modelling, automated testing, and the use of modern Python frameworks for backend development.</w:t>
+        <w:t xml:space="preserve">One challenge encountered during development involved ensuring consistency between SQLAlchemy database models and Pydantic response schemas. This required enabling ORM compatibility within Pydantic so that database objects could be correctly converted into API responses. </w:t>
+      </w:r>
+    </w:p>
+    <w:p>
+      <w:pPr>
+        <w:rPr>
+          <w:lang w:val="en-AE" w:eastAsia="en-US"/>
+        </w:rPr>
+      </w:pPr>
+      <w:r>
+        <w:rPr>
+          <w:lang w:val="en-AE" w:eastAsia="en-US"/>
+        </w:rPr>
+        <w:lastRenderedPageBreak/>
+        <w:t xml:space="preserve">Another challenge involved importing external datasets and maintaining correct relationships between teams, players, and matches. Data inconsistencies such as variations in team names (for example “Man City” and “Manchester City”) required additional preprocessing during the import process. </w:t>
+      </w:r>
+    </w:p>
+    <w:p>
+      <w:pPr>
+        <w:rPr>
+          <w:lang w:val="en-AE" w:eastAsia="en-US"/>
+        </w:rPr>
+      </w:pPr>
+      <w:r>
+        <w:rPr>
+          <w:lang w:val="en-AE" w:eastAsia="en-US"/>
+        </w:rPr>
+        <w:t>This project provided practical experience in designing modular APIs, integrating relational databases, and implementing automated testing for web services.</w:t>
       </w:r>
     </w:p>
     <w:p>
@@ -2210,7 +2377,7 @@
           <w:lang w:val="en-AE" w:eastAsia="en-US"/>
         </w:rPr>
       </w:pPr>
-      <w:bookmarkStart w:id="8" w:name="_Toc224051441"/>
+      <w:bookmarkStart w:id="8" w:name="_Toc224314034"/>
       <w:r>
         <w:rPr>
           <w:lang w:val="en-AE" w:eastAsia="en-US"/>
@@ -2242,46 +2409,33 @@
         <w:rPr>
           <w:lang w:val="en-AE" w:eastAsia="en-US"/>
         </w:rPr>
-        <w:t xml:space="preserve">Authentication and authorization mechanisms could be added to restrict write operations and protect sensitive endpoints. </w:t>
-      </w:r>
-    </w:p>
-    <w:p>
-      <w:pPr>
-        <w:rPr>
-          <w:lang w:val="en-AE" w:eastAsia="en-US"/>
-        </w:rPr>
-      </w:pPr>
-      <w:r>
-        <w:rPr>
-          <w:lang w:val="en-AE" w:eastAsia="en-US"/>
-        </w:rPr>
-        <w:t xml:space="preserve">Additional analytical features could be developed, such as advanced player statistics, predictive match analysis, or team comparison tools. </w:t>
-      </w:r>
-    </w:p>
-    <w:p>
-      <w:pPr>
-        <w:rPr>
-          <w:lang w:val="en-AE" w:eastAsia="en-US"/>
-        </w:rPr>
-      </w:pPr>
-      <w:r>
-        <w:rPr>
-          <w:lang w:val="en-AE" w:eastAsia="en-US"/>
-        </w:rPr>
-        <w:t xml:space="preserve">Caching techniques could also be introduced to improve performance for complex analytical queries. </w:t>
-      </w:r>
-    </w:p>
-    <w:p>
-      <w:pPr>
-        <w:rPr>
-          <w:lang w:val="en-AE" w:eastAsia="en-US"/>
-        </w:rPr>
-      </w:pPr>
-      <w:r>
-        <w:rPr>
-          <w:lang w:val="en-AE" w:eastAsia="en-US"/>
-        </w:rPr>
-        <w:t>Finally, the API could be deployed to a cloud hosting platform to enable public access and improve scalability.</w:t>
+        <w:t xml:space="preserve">Authentication and authorization mechanisms could be introduced to restrict write operations and protect sensitive endpoints. </w:t>
+      </w:r>
+    </w:p>
+    <w:p>
+      <w:pPr>
+        <w:rPr>
+          <w:lang w:val="en-AE" w:eastAsia="en-US"/>
+        </w:rPr>
+      </w:pPr>
+      <w:r>
+        <w:rPr>
+          <w:lang w:val="en-AE" w:eastAsia="en-US"/>
+        </w:rPr>
+        <w:t xml:space="preserve">Additional analytics could be developed, including advanced player statistics, predictive match analysis, and team comparison tools. </w:t>
+      </w:r>
+    </w:p>
+    <w:p>
+      <w:pPr>
+        <w:rPr>
+          <w:lang w:val="en-AE" w:eastAsia="en-US"/>
+        </w:rPr>
+      </w:pPr>
+      <w:r>
+        <w:rPr>
+          <w:lang w:val="en-AE" w:eastAsia="en-US"/>
+        </w:rPr>
+        <w:t xml:space="preserve">Caching mechanisms could also be implemented to improve performance for computationally expensive analytical queries. </w:t>
       </w:r>
     </w:p>
     <w:p>
@@ -2295,7 +2449,7 @@
           <w:lang w:val="en-AE" w:eastAsia="en-US"/>
         </w:rPr>
       </w:pPr>
-      <w:bookmarkStart w:id="9" w:name="_Toc224051442"/>
+      <w:bookmarkStart w:id="9" w:name="_Toc224314035"/>
       <w:r>
         <w:rPr>
           <w:lang w:val="en-AE" w:eastAsia="en-US"/>
@@ -2314,40 +2468,33 @@
         <w:rPr>
           <w:lang w:val="en-AE" w:eastAsia="en-US"/>
         </w:rPr>
-        <w:t xml:space="preserve">Generative AI tools were used during the development of this project to assist with planning, debugging, and improving documentation. </w:t>
-      </w:r>
-    </w:p>
-    <w:p>
-      <w:pPr>
-        <w:rPr>
-          <w:lang w:val="en-AE" w:eastAsia="en-US"/>
-        </w:rPr>
-      </w:pPr>
-      <w:r>
-        <w:rPr>
-          <w:lang w:val="en-AE" w:eastAsia="en-US"/>
-        </w:rPr>
-        <w:t xml:space="preserve">AI tools were primarily used to explore alternative design approaches, understand framework features, and troubleshoot implementation issues. </w:t>
-      </w:r>
-    </w:p>
-    <w:p>
-      <w:pPr>
-        <w:rPr>
-          <w:lang w:val="en-AE" w:eastAsia="en-US"/>
-        </w:rPr>
-      </w:pPr>
-      <w:r>
-        <w:rPr>
-          <w:lang w:val="en-AE" w:eastAsia="en-US"/>
-        </w:rPr>
-        <w:lastRenderedPageBreak/>
-        <w:t>All final implementation decisions and integration of code were performed independently by the author. The use of AI followed the coursework guidelines and was declared transparently as required by the assessment brief</w:t>
-      </w:r>
-      <w:r>
-        <w:rPr>
-          <w:lang w:val="en-AE" w:eastAsia="en-US"/>
-        </w:rPr>
-        <w:t>.</w:t>
+        <w:t xml:space="preserve">Generative AI tools were used during the development of this project to assist with planning, debugging, and documentation drafting. </w:t>
+      </w:r>
+    </w:p>
+    <w:p>
+      <w:pPr>
+        <w:rPr>
+          <w:lang w:val="en-AE" w:eastAsia="en-US"/>
+        </w:rPr>
+      </w:pPr>
+      <w:r>
+        <w:rPr>
+          <w:lang w:val="en-AE" w:eastAsia="en-US"/>
+        </w:rPr>
+        <w:t xml:space="preserve">AI assistance was used to help identify and resolve implementation issues, such as handling inconsistencies in imported datasets (for example duplicate team names). Generative AI was also used to support the development of the front-end dashboard by suggesting interface structures and client-side implementation approaches based on the chosen technology stack. </w:t>
+      </w:r>
+    </w:p>
+    <w:p>
+      <w:pPr>
+        <w:rPr>
+          <w:lang w:val="en-AE" w:eastAsia="en-US"/>
+        </w:rPr>
+      </w:pPr>
+      <w:r>
+        <w:rPr>
+          <w:lang w:val="en-AE" w:eastAsia="en-US"/>
+        </w:rPr>
+        <w:t>All architectural decisions, code integration, testing, and final implementation were performed independently by the author. AI outputs were reviewed and adapted as development assistance rather than direct replacements for independent work.</w:t>
       </w:r>
     </w:p>
     <w:sectPr>
@@ -2355,8 +2502,8 @@
       <w:footnotePr>
         <w:numRestart w:val="eachSect"/>
       </w:footnotePr>
-      <w:pgSz w:w="11894" w:h="16834"/>
-      <w:pgMar w:top="1440" w:right="1440" w:bottom="1440" w:left="1440" w:header="720" w:footer="720" w:gutter="0"/>
+      <w:pgSz w:w="11906" w:h="16838"/>
+      <w:pgMar w:top="1440" w:right="1080" w:bottom="1440" w:left="1080" w:header="720" w:footer="720" w:gutter="0"/>
       <w:pgNumType w:fmt="lowerRoman" w:start="1"/>
       <w:cols w:space="720"/>
       <w:titlePg/>
@@ -4099,7 +4246,7 @@
 </file>
 
 <file path=customXml/itemProps1.xml><?xml version="1.0" encoding="utf-8"?>
-<ds:datastoreItem xmlns:ds="http://schemas.openxmlformats.org/officeDocument/2006/customXml" ds:itemID="{D7664F6D-80C3-9245-AB80-9EC623E90C84}">
+<ds:datastoreItem xmlns:ds="http://schemas.openxmlformats.org/officeDocument/2006/customXml" ds:itemID="{30CB3AFA-D30A-3143-B5BB-A6445A2C513D}">
   <ds:schemaRefs>
     <ds:schemaRef ds:uri="http://schemas.openxmlformats.org/officeDocument/2006/bibliography"/>
   </ds:schemaRefs>

</xml_diff>